<commit_message>
docs(submission): fill applicant info & signature into appendix1/2 docx
- 별첨1 참가신청서: 성명·학번·소속·연락처·이메일·신청일·서명 기입
- 별첨2 개인정보 동의서: 성명·날짜·서명 기입
- 원본 docx 본문 placeholder를 in-place 치환 (서식·바이트구조 유지)
</commit_message>
<xml_diff>
--- a/docs/submission/final/appendix1_application-form.docx
+++ b/docs/submission/final/appendix1_application-form.docx
@@ -16,7 +16,7 @@
         <w:pStyle w:val="BlockText"/>
       </w:pPr>
       <w:r>
-        <w:t xml:space="preserve">2026학년도 HYCU AI 학습법 공모전 — 공식 양식(docx)에 옮겨 적기 위한 작성본. 표의 「○○ (본인 작성)」 부분만 본인이 채우면 됩니다.</w:t>
+        <w:t xml:space="preserve">2026학년도 HYCU AI 학습법 공모전 — 공식 양식(docx)에 옮겨 적기 위한 작성본. 표의 이재철 (인) 부분만 본인이 채우면 됩니다.</w:t>
       </w:r>
     </w:p>
     <w:bookmarkStart w:id="20" w:name="기본정보"/>
@@ -244,7 +244,7 @@
               <w:jc w:val="left"/>
             </w:pPr>
             <w:r>
-              <w:t xml:space="preserve">「성명 (본인 작성)」</w:t>
+              <w:t xml:space="preserve">이재철</w:t>
             </w:r>
           </w:p>
         </w:tc>
@@ -270,7 +270,7 @@
               <w:jc w:val="left"/>
             </w:pPr>
             <w:r>
-              <w:t xml:space="preserve">「11자리 학번 (본인 작성)」</w:t>
+              <w:t xml:space="preserve">2024112536</w:t>
             </w:r>
           </w:p>
         </w:tc>
@@ -296,7 +296,7 @@
               <w:jc w:val="left"/>
             </w:pPr>
             <w:r>
-              <w:t xml:space="preserve">한양사이버대학교 / 「정확한 학부·학과·전공명 (본인 작성)」</w:t>
+              <w:t xml:space="preserve">한양사이버대학교 / 컴퓨터공학과</w:t>
             </w:r>
           </w:p>
         </w:tc>
@@ -322,7 +322,7 @@
               <w:jc w:val="left"/>
             </w:pPr>
             <w:r>
-              <w:t xml:space="preserve">「010-****-**** (본인 작성)」</w:t>
+              <w:t xml:space="preserve">010-5757-9592</w:t>
             </w:r>
           </w:p>
         </w:tc>
@@ -348,7 +348,7 @@
               <w:jc w:val="left"/>
             </w:pPr>
             <w:r>
-              <w:t xml:space="preserve">「이메일 (본인 작성)」</w:t>
+              <w:t xml:space="preserve">qws941@kakao.com</w:t>
             </w:r>
           </w:p>
         </w:tc>
@@ -417,7 +417,7 @@
         <w:pStyle w:val="Compact"/>
       </w:pPr>
       <w:r>
-        <w:t xml:space="preserve">신청일: 「2026년 ○○월 ○○일 (본인 작성)」</w:t>
+        <w:t xml:space="preserve">신청일: 2026년 06월 09일</w:t>
       </w:r>
     </w:p>
     <w:p>
@@ -429,7 +429,7 @@
         <w:pStyle w:val="Compact"/>
       </w:pPr>
       <w:r>
-        <w:t xml:space="preserve">신청자(대표자): 「성명 (본인 작성)」 (서명: 「서명 (본인 작성)」)</w:t>
+        <w:t xml:space="preserve">신청자(대표자): 이재철 (서명: 이재철 (인))</w:t>
       </w:r>
     </w:p>
     <w:p>

</xml_diff>

<commit_message>
docs(submission): unify subject/title and fill email applicant info
- 별첨1 docx/md: 주제·제목을 확정안으로 통일 (흩어진 학습을 역량으로 / 설명·진단·증거 3-루프 학습법)
- 별첨1/2 docx: 표 셀 placeholder 정밀 치환 (안내문 보존, 서식·XML 무결성 유지)
- submission-email.md: 메일 제목·발신자 정보(이재철/2024112536/연락처) 기입
- appendix1.md 주제 오타 수정
</commit_message>
<xml_diff>
--- a/docs/submission/final/appendix1_application-form.docx
+++ b/docs/submission/final/appendix1_application-form.docx
@@ -16,7 +16,7 @@
         <w:pStyle w:val="BlockText"/>
       </w:pPr>
       <w:r>
-        <w:t xml:space="preserve">2026학년도 HYCU AI 학습법 공모전 — 공식 양식(docx)에 옮겨 적기 위한 작성본. 표의 이재철 (인) 부분만 본인이 채우면 됩니다.</w:t>
+        <w:t xml:space="preserve">2026학년도 HYCU AI 학습법 공모전 — 공식 양식(docx)에 옮겨 적기 위한 작성본. 표의 「○○ (본인 작성)」 부분만 본인이 채우면 됩니다.</w:t>
       </w:r>
     </w:p>
     <w:bookmarkStart w:id="20" w:name="기본정보"/>
@@ -141,7 +141,7 @@
               <w:jc w:val="left"/>
             </w:pPr>
             <w:r>
-              <w:t xml:space="preserve">AI를 학습 코치로 활용한 과목별 역량 증거 학습법</w:t>
+              <w:t xml:space="preserve">흩어진 학습을 역량으로 — AI로 만든 나만의 학습 이력서 (learnprint)</w:t>
             </w:r>
           </w:p>
         </w:tc>
@@ -167,7 +167,7 @@
               <w:jc w:val="left"/>
             </w:pPr>
             <w:r>
-              <w:t xml:space="preserve">HYCU 학습 이력서(learnprint) — 흩어진 전공 학습을 AI로 역량·증거화하기</w:t>
+              <w:t xml:space="preserve">HYCU 학습 이력서(learnprint) — 설명·진단·증거 3-루프 학습법</w:t>
             </w:r>
           </w:p>
         </w:tc>

</xml_diff>

<commit_message>
fix(submission): repair checkbox glyph breakage + deslop AI responses + neutral app wording
- 별첨1·2·3 docx: ☑/☐ → ■/□ 치환 (심볼 폰트가 뒤 한글을 두부로 깨뜨리던 레이아웃 결함 수정, LibreOffice 렌더 검증 완료)
- server/prompt.ts: AI 응답에서 인사말·과장 형용사·마크다운 기호(**,##) 금지 지침 추가 (실제 응답 검증 — 슬롭/마크다운 제거됨)
- App.tsx/App.test.tsx: 공모전 메타 문구 '제출물 제작 흐름/최종 제출물 패키지'→'이력서 만들기 흐름/완성된 학습 이력서' 등 일반 학습이력서 표현으로 교체
</commit_message>
<xml_diff>
--- a/docs/submission/final/appendix1_application-form.docx
+++ b/docs/submission/final/appendix1_application-form.docx
@@ -89,7 +89,7 @@
               <w:jc w:val="left"/>
             </w:pPr>
             <w:r>
-              <w:t xml:space="preserve">☑ 개인 ☐ 팀</w:t>
+              <w:t xml:space="preserve">■ 개인 □ 팀</w:t>
             </w:r>
           </w:p>
         </w:tc>
@@ -115,7 +115,7 @@
               <w:jc w:val="left"/>
             </w:pPr>
             <w:r>
-              <w:t xml:space="preserve">☑ 제출 ☐ 미제출</w:t>
+              <w:t xml:space="preserve">■ 제출 □ 미제출</w:t>
             </w:r>
           </w:p>
         </w:tc>

</xml_diff>